<commit_message>
feat: support faculty profile updates and integrate Faculty Title Prefix parameter across portal inputs, APIs, and user guides
</commit_message>
<xml_diff>
--- a/user_guides/Esderos_Faculty_Portal_User_Guide.docx
+++ b/user_guides/Esderos_Faculty_Portal_User_Guide.docx
@@ -56,6 +56,8 @@
       <w:r>
         <w:rPr>
           <w:rFonts w:ascii="Calibri" w:cs="Calibri" w:eastAsia="Calibri" w:hAnsi="Calibri"/>
+          <w:i/>
+          <w:iCs/>
           <w:color w:val="475569"/>
           <w:sz w:val="22"/>
           <w:szCs w:val="22"/>
@@ -461,6 +463,11 @@
         </w:tc>
       </w:tr>
     </w:tbl>
+    <w:p>
+      <w:pPr>
+        <w:spacing w:before="240"/>
+      </w:pPr>
+    </w:p>
     <w:p>
       <w:pPr>
         <w:pStyle w:val="Heading1"/>

</xml_diff>